<commit_message>
Record Ahmed commit IDs in report
</commit_message>
<xml_diff>
--- a/docs/Assignment3_Documentation.docx
+++ b/docs/Assignment3_Documentation.docx
@@ -36039,7 +36039,11 @@
                 <w:sz w:val="18"/>
                 <w:szCs w:val="18"/>
               </w:rPr>
-              <w:t>[commit IDs from Git history]</w:t>
+              <w:t>7431693, 3745d7f, ff5b153</w:t>
+              <w:br/>
+              <w:t>bfa5487, 1226172, 833ec52</w:t>
+              <w:br/>
+              <w:t>e4def55</w:t>
             </w:r>
           </w:p>
         </w:tc>
@@ -36214,7 +36218,7 @@
                 <w:sz w:val="18"/>
                 <w:szCs w:val="18"/>
               </w:rPr>
-              <w:t>[commit IDs from Git history]</w:t>
+              <w:t>Pending Abdullah's commits</w:t>
             </w:r>
           </w:p>
         </w:tc>

</xml_diff>